<commit_message>
Add anonymized manuscript + title page; trim abstract to ~200 words
- Trim English abstract from ~270 to 197 words for Brill Biblical
  Interpretation house preference
- Add anonymized manuscript (byline/affiliation stripped) for
  double-blind peer review
- Add separate title page with author details for editor submission

Co-Authored-By: Claude Opus 4.7 <noreply@anthropic.com>
</commit_message>
<xml_diff>
--- a/job_mencius_paper_english_full.docx
+++ b/job_mencius_paper_english_full.docx
@@ -108,7 +108,7 @@
           <w:sz w:val="24"/>
           <w:szCs w:val="24"/>
         </w:rPr>
-        <w:t xml:space="preserve"> 6B15 (the fifteenth section of "Gaozi II") through the method of cross-textual hermeneutics, and argues that the two texts, far from yielding a synthesis, generate a productive tension over the role of suffering in moral formation. Earlier comparison—above all Lee Yearley’s 1981 pairing of Job with Confucius—worked within an Aristotelian frame and concluded that virtue can be held independent of reward. I take three further steps: I replace the imported philosophical frame with Archie Lee’s cross-textual method, which lets each text argue in its own idiom; I substitute </w:t>
+        <w:t xml:space="preserve"> 6B15 (the fifteenth section of "Gaozi II") through cross-textual hermeneutics, arguing that the two texts generate not a synthesis but a productive tension over the role of suffering in moral formation. The most important precedent, Lee Yearley’s 1981 pairing of Job with Confucius, worked within an Aristotelian frame and concluded that virtue can be held independent of reward. I take three further steps: I replace that imported frame with Archie Lee’s cross-textual method, which lets each text argue in its own idiom; I substitute </w:t>
       </w:r>
       <w:r>
         <w:rPr>
@@ -144,7 +144,7 @@
           <w:sz w:val="24"/>
           <w:szCs w:val="24"/>
         </w:rPr>
-        <w:t xml:space="preserve">, a text far more explicit about the pedagogy of adversity; and I make Job 23:10 (</w:t>
+        <w:t xml:space="preserve">, a text far more explicit about the pedagogy of adversity; and I make Job 23:10 ("when he has tested me, I shall come out like gold," </w:t>
       </w:r>
       <w:r>
         <w:rPr>
@@ -160,7 +160,7 @@
           <w:sz w:val="24"/>
           <w:szCs w:val="24"/>
         </w:rPr>
-        <w:t xml:space="preserve">, "when he has tested me, I shall come out like gold") the hinge of the argument. A Mencian reading exposes a teleological instinct latent in Job’s metallurgical image—an instinct that Greco-Roman frameworks (Stoic endurance, Platonic ascent, Leibnizian optimism) have tended to obscure. The structural parallel between </w:t>
+        <w:t xml:space="preserve">) the hinge of the argument. Read with Mencian eyes, Job’s metallurgical image betrays a teleological instinct that Greco-Roman frameworks—Stoic endurance, Platonic ascent, Leibnizian optimism—have tended to obscure. The structural parallel between </w:t>
       </w:r>
       <w:r>
         <w:rPr>
@@ -212,7 +212,7 @@
           <w:sz w:val="24"/>
           <w:szCs w:val="24"/>
         </w:rPr>
-        <w:t xml:space="preserve"> (端, the moral "sprouts")—both of them qualities that suffering refines rather than creates—is the essay’s central contribution. Job restrains the Mencian tendency toward over-systematization; Mengzi keeps the Joban narrative from collapsing into nihilism. Read together, they suggest that Confucian thought can enrich biblical interpretation by recovering dimensions of Joban theodicy long screened off by the Greco-Roman philosophical inheritance.</w:t>
+        <w:t xml:space="preserve"> (端, the moral "sprouts"), both qualities that suffering refines rather than creates, is the essay’s central contribution. Job restrains the Mencian drift toward over-systematization; Mengzi keeps the Joban narrative from collapsing into nihilism.</w:t>
       </w:r>
     </w:p>
     <w:p>

</xml_diff>